<commit_message>
Move Amex Credits Maximizer to live
Co-Authored-By: Claude Sonnet 4.6 <noreply@anthropic.com>
</commit_message>
<xml_diff>
--- a/Website links to share.docx
+++ b/Website links to share.docx
@@ -442,6 +442,80 @@
             <w:szCs w:val="32"/>
           </w:rPr>
           <w:t>https://startup-idea-generator-ex43nobmv-aidan-s-projects1.vercel.app/</w:t>
+        </w:r>
+      </w:hyperlink>
+      <w:r>
+        <w:rPr>
+          <w:sz w:val="32"/>
+          <w:szCs w:val="32"/>
+        </w:rPr>
+        <w:t xml:space="preserve"> </w:t>
+      </w:r>
+    </w:p>
+    <w:p>
+      <w:pPr>
+        <w:pStyle w:val="ListParagraph"/>
+        <w:numPr>
+          <w:ilvl w:val="0"/>
+          <w:numId w:val="1"/>
+        </w:numPr>
+        <w:rPr>
+          <w:sz w:val="32"/>
+          <w:szCs w:val="32"/>
+        </w:rPr>
+      </w:pPr>
+      <w:r>
+        <w:rPr>
+          <w:sz w:val="32"/>
+          <w:szCs w:val="32"/>
+        </w:rPr>
+        <w:t xml:space="preserve">Penalty Shootout Game: </w:t>
+      </w:r>
+      <w:hyperlink r:id="rId17" w:history="1">
+        <w:r>
+          <w:rPr>
+            <w:rStyle w:val="Hyperlink"/>
+            <w:sz w:val="32"/>
+            <w:szCs w:val="32"/>
+          </w:rPr>
+          <w:t>https://penalty-shootout-rosy.vercel.app/</w:t>
+        </w:r>
+      </w:hyperlink>
+      <w:r>
+        <w:rPr>
+          <w:sz w:val="32"/>
+          <w:szCs w:val="32"/>
+        </w:rPr>
+        <w:t xml:space="preserve"> </w:t>
+      </w:r>
+    </w:p>
+    <w:p>
+      <w:pPr>
+        <w:pStyle w:val="ListParagraph"/>
+        <w:numPr>
+          <w:ilvl w:val="0"/>
+          <w:numId w:val="1"/>
+        </w:numPr>
+        <w:rPr>
+          <w:sz w:val="32"/>
+          <w:szCs w:val="32"/>
+        </w:rPr>
+      </w:pPr>
+      <w:r>
+        <w:rPr>
+          <w:sz w:val="32"/>
+          <w:szCs w:val="32"/>
+        </w:rPr>
+        <w:t xml:space="preserve">Amex credit app: </w:t>
+      </w:r>
+      <w:hyperlink r:id="rId18" w:history="1">
+        <w:r>
+          <w:rPr>
+            <w:rStyle w:val="Hyperlink"/>
+            <w:sz w:val="32"/>
+            <w:szCs w:val="32"/>
+          </w:rPr>
+          <w:t>https://amex-credits-maximizer.vercel.app/</w:t>
         </w:r>
       </w:hyperlink>
       <w:r>

</xml_diff>

<commit_message>
Move Allora to iOS Applications / Startups; add Startup Learning section
Co-Authored-By: Claude Opus 4.8 <noreply@anthropic.com>
</commit_message>
<xml_diff>
--- a/Website links to share.docx
+++ b/Website links to share.docx
@@ -516,6 +516,562 @@
             <w:szCs w:val="32"/>
           </w:rPr>
           <w:t>https://amex-credits-maximizer.vercel.app/</w:t>
+        </w:r>
+      </w:hyperlink>
+      <w:r>
+        <w:rPr>
+          <w:sz w:val="32"/>
+          <w:szCs w:val="32"/>
+        </w:rPr>
+        <w:t xml:space="preserve"> </w:t>
+      </w:r>
+    </w:p>
+    <w:p>
+      <w:pPr>
+        <w:pStyle w:val="ListParagraph"/>
+        <w:numPr>
+          <w:ilvl w:val="0"/>
+          <w:numId w:val="1"/>
+        </w:numPr>
+        <w:rPr>
+          <w:sz w:val="32"/>
+          <w:szCs w:val="32"/>
+        </w:rPr>
+      </w:pPr>
+      <w:r>
+        <w:rPr>
+          <w:sz w:val="32"/>
+          <w:szCs w:val="32"/>
+        </w:rPr>
+        <w:t xml:space="preserve">Travel itinerary app: </w:t>
+      </w:r>
+      <w:hyperlink r:id="rId19" w:history="1">
+        <w:r>
+          <w:rPr>
+            <w:rStyle w:val="Hyperlink"/>
+            <w:sz w:val="32"/>
+            <w:szCs w:val="32"/>
+          </w:rPr>
+          <w:t>https://travel-app-eta-peach.vercel.app/index.html</w:t>
+        </w:r>
+      </w:hyperlink>
+      <w:r>
+        <w:rPr>
+          <w:sz w:val="32"/>
+          <w:szCs w:val="32"/>
+        </w:rPr>
+        <w:t xml:space="preserve"> </w:t>
+      </w:r>
+    </w:p>
+    <w:p>
+      <w:pPr>
+        <w:pStyle w:val="ListParagraph"/>
+        <w:numPr>
+          <w:ilvl w:val="0"/>
+          <w:numId w:val="1"/>
+        </w:numPr>
+        <w:rPr>
+          <w:sz w:val="32"/>
+          <w:szCs w:val="32"/>
+        </w:rPr>
+      </w:pPr>
+      <w:r>
+        <w:rPr>
+          <w:sz w:val="32"/>
+          <w:szCs w:val="32"/>
+        </w:rPr>
+        <w:t xml:space="preserve">Personal doctor: </w:t>
+      </w:r>
+      <w:hyperlink r:id="rId20" w:history="1">
+        <w:r>
+          <w:rPr>
+            <w:rStyle w:val="Hyperlink"/>
+            <w:sz w:val="32"/>
+            <w:szCs w:val="32"/>
+          </w:rPr>
+          <w:t>https://personal-doctor-green.vercel.app/</w:t>
+        </w:r>
+      </w:hyperlink>
+      <w:r>
+        <w:rPr>
+          <w:sz w:val="32"/>
+          <w:szCs w:val="32"/>
+        </w:rPr>
+        <w:t xml:space="preserve"> </w:t>
+      </w:r>
+    </w:p>
+    <w:p>
+      <w:pPr>
+        <w:pStyle w:val="ListParagraph"/>
+        <w:numPr>
+          <w:ilvl w:val="0"/>
+          <w:numId w:val="1"/>
+        </w:numPr>
+        <w:rPr>
+          <w:sz w:val="32"/>
+          <w:szCs w:val="32"/>
+        </w:rPr>
+      </w:pPr>
+      <w:r>
+        <w:rPr>
+          <w:sz w:val="32"/>
+          <w:szCs w:val="32"/>
+        </w:rPr>
+        <w:t>Language</w:t>
+      </w:r>
+      <w:r>
+        <w:rPr>
+          <w:sz w:val="32"/>
+          <w:szCs w:val="32"/>
+        </w:rPr>
+        <w:t xml:space="preserve"> learning app:</w:t>
+      </w:r>
+      <w:r>
+        <w:rPr>
+          <w:sz w:val="32"/>
+          <w:szCs w:val="32"/>
+        </w:rPr>
+        <w:t xml:space="preserve"> </w:t>
+      </w:r>
+      <w:hyperlink r:id="rId21" w:history="1">
+        <w:r>
+          <w:rPr>
+            <w:rStyle w:val="Hyperlink"/>
+            <w:sz w:val="32"/>
+            <w:szCs w:val="32"/>
+          </w:rPr>
+          <w:t>https://learnallora.com/</w:t>
+        </w:r>
+      </w:hyperlink>
+      <w:r>
+        <w:rPr>
+          <w:sz w:val="32"/>
+          <w:szCs w:val="32"/>
+        </w:rPr>
+        <w:t xml:space="preserve"> </w:t>
+      </w:r>
+    </w:p>
+    <w:p>
+      <w:pPr>
+        <w:pStyle w:val="ListParagraph"/>
+        <w:numPr>
+          <w:ilvl w:val="0"/>
+          <w:numId w:val="1"/>
+        </w:numPr>
+        <w:rPr>
+          <w:sz w:val="32"/>
+          <w:szCs w:val="32"/>
+        </w:rPr>
+      </w:pPr>
+      <w:r>
+        <w:rPr>
+          <w:sz w:val="32"/>
+          <w:szCs w:val="32"/>
+        </w:rPr>
+        <w:t xml:space="preserve">Movie, series, books rankings website: </w:t>
+      </w:r>
+      <w:hyperlink r:id="rId22" w:history="1">
+        <w:r>
+          <w:rPr>
+            <w:rStyle w:val="Hyperlink"/>
+            <w:sz w:val="32"/>
+            <w:szCs w:val="32"/>
+          </w:rPr>
+          <w:t>https://personal-rankings.vercel.app/</w:t>
+        </w:r>
+      </w:hyperlink>
+      <w:r>
+        <w:rPr>
+          <w:sz w:val="32"/>
+          <w:szCs w:val="32"/>
+        </w:rPr>
+        <w:t xml:space="preserve"> </w:t>
+      </w:r>
+    </w:p>
+    <w:p>
+      <w:pPr>
+        <w:pStyle w:val="ListParagraph"/>
+        <w:numPr>
+          <w:ilvl w:val="0"/>
+          <w:numId w:val="1"/>
+        </w:numPr>
+        <w:rPr>
+          <w:sz w:val="32"/>
+          <w:szCs w:val="32"/>
+        </w:rPr>
+      </w:pPr>
+      <w:r>
+        <w:rPr>
+          <w:sz w:val="32"/>
+          <w:szCs w:val="32"/>
+        </w:rPr>
+        <w:t xml:space="preserve">World cup stadium run: </w:t>
+      </w:r>
+      <w:hyperlink r:id="rId23" w:history="1">
+        <w:r>
+          <w:rPr>
+            <w:rStyle w:val="Hyperlink"/>
+            <w:sz w:val="32"/>
+            <w:szCs w:val="32"/>
+          </w:rPr>
+          <w:t>https://stadium-run.vercel.app/</w:t>
+        </w:r>
+      </w:hyperlink>
+      <w:r>
+        <w:rPr>
+          <w:sz w:val="32"/>
+          <w:szCs w:val="32"/>
+        </w:rPr>
+        <w:t xml:space="preserve"> </w:t>
+      </w:r>
+    </w:p>
+    <w:p>
+      <w:pPr>
+        <w:pStyle w:val="ListParagraph"/>
+        <w:numPr>
+          <w:ilvl w:val="0"/>
+          <w:numId w:val="1"/>
+        </w:numPr>
+        <w:rPr>
+          <w:sz w:val="32"/>
+          <w:szCs w:val="32"/>
+        </w:rPr>
+      </w:pPr>
+      <w:r>
+        <w:rPr>
+          <w:sz w:val="32"/>
+          <w:szCs w:val="32"/>
+        </w:rPr>
+        <w:lastRenderedPageBreak/>
+        <w:t xml:space="preserve">Golf swing assessor app: </w:t>
+      </w:r>
+      <w:hyperlink r:id="rId24" w:history="1">
+        <w:r>
+          <w:rPr>
+            <w:rStyle w:val="Hyperlink"/>
+            <w:sz w:val="32"/>
+            <w:szCs w:val="32"/>
+          </w:rPr>
+          <w:t>https://golf-swing-assessor.vercel.app/</w:t>
+        </w:r>
+      </w:hyperlink>
+      <w:r>
+        <w:rPr>
+          <w:sz w:val="32"/>
+          <w:szCs w:val="32"/>
+        </w:rPr>
+        <w:t xml:space="preserve"> </w:t>
+      </w:r>
+    </w:p>
+    <w:p>
+      <w:pPr>
+        <w:pStyle w:val="ListParagraph"/>
+        <w:numPr>
+          <w:ilvl w:val="0"/>
+          <w:numId w:val="1"/>
+        </w:numPr>
+        <w:rPr>
+          <w:sz w:val="32"/>
+          <w:szCs w:val="32"/>
+        </w:rPr>
+      </w:pPr>
+      <w:r>
+        <w:rPr>
+          <w:sz w:val="32"/>
+          <w:szCs w:val="32"/>
+        </w:rPr>
+        <w:t xml:space="preserve">History learning app: </w:t>
+      </w:r>
+      <w:hyperlink r:id="rId25" w:history="1">
+        <w:r>
+          <w:rPr>
+            <w:rStyle w:val="Hyperlink"/>
+            <w:sz w:val="32"/>
+            <w:szCs w:val="32"/>
+          </w:rPr>
+          <w:t>https://history-learning-platform.vercel.app/</w:t>
+        </w:r>
+      </w:hyperlink>
+      <w:r>
+        <w:rPr>
+          <w:sz w:val="32"/>
+          <w:szCs w:val="32"/>
+        </w:rPr>
+        <w:t xml:space="preserve"> </w:t>
+      </w:r>
+    </w:p>
+    <w:p>
+      <w:pPr>
+        <w:pStyle w:val="ListParagraph"/>
+        <w:numPr>
+          <w:ilvl w:val="0"/>
+          <w:numId w:val="1"/>
+        </w:numPr>
+        <w:rPr>
+          <w:sz w:val="32"/>
+          <w:szCs w:val="32"/>
+        </w:rPr>
+      </w:pPr>
+      <w:r>
+        <w:rPr>
+          <w:sz w:val="32"/>
+          <w:szCs w:val="32"/>
+        </w:rPr>
+        <w:t>Post-MBA Career Explorer app:</w:t>
+      </w:r>
+      <w:r>
+        <w:rPr>
+          <w:sz w:val="32"/>
+          <w:szCs w:val="32"/>
+        </w:rPr>
+        <w:t xml:space="preserve"> </w:t>
+      </w:r>
+      <w:hyperlink r:id="rId26" w:history="1">
+        <w:r>
+          <w:rPr>
+            <w:rStyle w:val="Hyperlink"/>
+            <w:sz w:val="32"/>
+            <w:szCs w:val="32"/>
+          </w:rPr>
+          <w:t>https://post-mba-career-explorer.vercel.app/</w:t>
+        </w:r>
+      </w:hyperlink>
+      <w:r>
+        <w:rPr>
+          <w:sz w:val="32"/>
+          <w:szCs w:val="32"/>
+        </w:rPr>
+        <w:t xml:space="preserve"> </w:t>
+      </w:r>
+    </w:p>
+    <w:p>
+      <w:pPr>
+        <w:pStyle w:val="ListParagraph"/>
+        <w:numPr>
+          <w:ilvl w:val="0"/>
+          <w:numId w:val="1"/>
+        </w:numPr>
+        <w:rPr>
+          <w:sz w:val="32"/>
+          <w:szCs w:val="32"/>
+        </w:rPr>
+      </w:pPr>
+      <w:r>
+        <w:rPr>
+          <w:sz w:val="32"/>
+          <w:szCs w:val="32"/>
+        </w:rPr>
+        <w:t xml:space="preserve">Famous quotes app: </w:t>
+      </w:r>
+      <w:hyperlink r:id="rId27" w:history="1">
+        <w:r>
+          <w:rPr>
+            <w:rStyle w:val="Hyperlink"/>
+            <w:sz w:val="32"/>
+            <w:szCs w:val="32"/>
+          </w:rPr>
+          <w:t>https://famous-quotes-nine.vercel.app/</w:t>
+        </w:r>
+      </w:hyperlink>
+      <w:r>
+        <w:rPr>
+          <w:sz w:val="32"/>
+          <w:szCs w:val="32"/>
+        </w:rPr>
+        <w:t xml:space="preserve"> </w:t>
+      </w:r>
+    </w:p>
+    <w:p>
+      <w:pPr>
+        <w:pStyle w:val="ListParagraph"/>
+        <w:numPr>
+          <w:ilvl w:val="0"/>
+          <w:numId w:val="1"/>
+        </w:numPr>
+        <w:rPr>
+          <w:sz w:val="32"/>
+          <w:szCs w:val="32"/>
+        </w:rPr>
+      </w:pPr>
+      <w:r>
+        <w:rPr>
+          <w:sz w:val="32"/>
+          <w:szCs w:val="32"/>
+        </w:rPr>
+        <w:t xml:space="preserve">Startup learning app: </w:t>
+      </w:r>
+      <w:hyperlink r:id="rId28" w:history="1">
+        <w:r>
+          <w:rPr>
+            <w:rStyle w:val="Hyperlink"/>
+            <w:sz w:val="32"/>
+            <w:szCs w:val="32"/>
+          </w:rPr>
+          <w:t>https://foundry-beta-henna.vercel.app/</w:t>
+        </w:r>
+      </w:hyperlink>
+      <w:r>
+        <w:rPr>
+          <w:sz w:val="32"/>
+          <w:szCs w:val="32"/>
+        </w:rPr>
+        <w:t xml:space="preserve"> </w:t>
+      </w:r>
+    </w:p>
+    <w:p>
+      <w:pPr>
+        <w:pStyle w:val="ListParagraph"/>
+        <w:numPr>
+          <w:ilvl w:val="0"/>
+          <w:numId w:val="1"/>
+        </w:numPr>
+        <w:rPr>
+          <w:sz w:val="32"/>
+          <w:szCs w:val="32"/>
+        </w:rPr>
+      </w:pPr>
+      <w:r>
+        <w:rPr>
+          <w:sz w:val="32"/>
+          <w:szCs w:val="32"/>
+        </w:rPr>
+        <w:t xml:space="preserve">Golf App: </w:t>
+      </w:r>
+      <w:hyperlink r:id="rId29" w:history="1">
+        <w:r>
+          <w:rPr>
+            <w:rStyle w:val="Hyperlink"/>
+            <w:sz w:val="32"/>
+            <w:szCs w:val="32"/>
+          </w:rPr>
+          <w:t>https://</w:t>
+        </w:r>
+        <w:r>
+          <w:rPr>
+            <w:rStyle w:val="Hyperlink"/>
+            <w:sz w:val="32"/>
+            <w:szCs w:val="32"/>
+          </w:rPr>
+          <w:t>p</w:t>
+        </w:r>
+        <w:r>
+          <w:rPr>
+            <w:rStyle w:val="Hyperlink"/>
+            <w:sz w:val="32"/>
+            <w:szCs w:val="32"/>
+          </w:rPr>
+          <w:t>ublinx.app/</w:t>
+        </w:r>
+      </w:hyperlink>
+      <w:r>
+        <w:rPr>
+          <w:sz w:val="32"/>
+          <w:szCs w:val="32"/>
+        </w:rPr>
+        <w:t xml:space="preserve"> </w:t>
+      </w:r>
+    </w:p>
+    <w:p>
+      <w:pPr>
+        <w:pStyle w:val="ListParagraph"/>
+        <w:numPr>
+          <w:ilvl w:val="0"/>
+          <w:numId w:val="1"/>
+        </w:numPr>
+        <w:rPr>
+          <w:sz w:val="32"/>
+          <w:szCs w:val="32"/>
+        </w:rPr>
+      </w:pPr>
+      <w:r>
+        <w:rPr>
+          <w:sz w:val="32"/>
+          <w:szCs w:val="32"/>
+        </w:rPr>
+        <w:t xml:space="preserve">Date app: </w:t>
+      </w:r>
+      <w:hyperlink r:id="rId30" w:history="1">
+        <w:r>
+          <w:rPr>
+            <w:rStyle w:val="Hyperlink"/>
+            <w:sz w:val="32"/>
+            <w:szCs w:val="32"/>
+          </w:rPr>
+          <w:t>https://date-app-henna.vercel.app/</w:t>
+        </w:r>
+      </w:hyperlink>
+      <w:r>
+        <w:rPr>
+          <w:sz w:val="32"/>
+          <w:szCs w:val="32"/>
+        </w:rPr>
+        <w:t xml:space="preserve"> </w:t>
+      </w:r>
+    </w:p>
+    <w:p>
+      <w:pPr>
+        <w:pStyle w:val="ListParagraph"/>
+        <w:numPr>
+          <w:ilvl w:val="0"/>
+          <w:numId w:val="1"/>
+        </w:numPr>
+        <w:rPr>
+          <w:sz w:val="32"/>
+          <w:szCs w:val="32"/>
+        </w:rPr>
+      </w:pPr>
+      <w:r>
+        <w:rPr>
+          <w:sz w:val="32"/>
+          <w:szCs w:val="32"/>
+        </w:rPr>
+        <w:t xml:space="preserve">Pe Ops Learning app: </w:t>
+      </w:r>
+      <w:hyperlink r:id="rId31" w:history="1">
+        <w:r>
+          <w:rPr>
+            <w:rStyle w:val="Hyperlink"/>
+            <w:sz w:val="32"/>
+            <w:szCs w:val="32"/>
+          </w:rPr>
+          <w:t>https://peops-prep.vercel.app/</w:t>
+        </w:r>
+      </w:hyperlink>
+      <w:r>
+        <w:rPr>
+          <w:sz w:val="32"/>
+          <w:szCs w:val="32"/>
+        </w:rPr>
+        <w:t xml:space="preserve"> </w:t>
+      </w:r>
+    </w:p>
+    <w:p>
+      <w:pPr>
+        <w:pStyle w:val="ListParagraph"/>
+        <w:numPr>
+          <w:ilvl w:val="0"/>
+          <w:numId w:val="1"/>
+        </w:numPr>
+        <w:rPr>
+          <w:sz w:val="32"/>
+          <w:szCs w:val="32"/>
+        </w:rPr>
+      </w:pPr>
+      <w:r>
+        <w:rPr>
+          <w:sz w:val="32"/>
+          <w:szCs w:val="32"/>
+        </w:rPr>
+        <w:t xml:space="preserve">Behavioral prep: </w:t>
+      </w:r>
+      <w:hyperlink r:id="rId32" w:history="1">
+        <w:r>
+          <w:rPr>
+            <w:rStyle w:val="Hyperlink"/>
+            <w:sz w:val="32"/>
+            <w:szCs w:val="32"/>
+          </w:rPr>
+          <w:t>https://behavioral-prep.vercel.app/</w:t>
         </w:r>
       </w:hyperlink>
       <w:r>

</xml_diff>

<commit_message>
Add Spanish to Allora description
Co-Authored-By: Claude Opus 4.8 (1M context) <noreply@anthropic.com>
</commit_message>
<xml_diff>
--- a/Website links to share.docx
+++ b/Website links to share.docx
@@ -182,7 +182,7 @@
             <w:sz w:val="32"/>
             <w:szCs w:val="32"/>
           </w:rPr>
-          <w:t>https://landing-page-alpha-ten-99.vercel.app/</w:t>
+          <w:t>https://aidanlconnolly.com/</w:t>
         </w:r>
       </w:hyperlink>
       <w:r>
@@ -944,23 +944,7 @@
             <w:sz w:val="32"/>
             <w:szCs w:val="32"/>
           </w:rPr>
-          <w:t>https://</w:t>
-        </w:r>
-        <w:r>
-          <w:rPr>
-            <w:rStyle w:val="Hyperlink"/>
-            <w:sz w:val="32"/>
-            <w:szCs w:val="32"/>
-          </w:rPr>
-          <w:t>p</w:t>
-        </w:r>
-        <w:r>
-          <w:rPr>
-            <w:rStyle w:val="Hyperlink"/>
-            <w:sz w:val="32"/>
-            <w:szCs w:val="32"/>
-          </w:rPr>
-          <w:t>ublinx.app/</w:t>
+          <w:t>https://publinx.app/</w:t>
         </w:r>
       </w:hyperlink>
       <w:r>
@@ -1072,6 +1056,43 @@
             <w:szCs w:val="32"/>
           </w:rPr>
           <w:t>https://behavioral-prep.vercel.app/</w:t>
+        </w:r>
+      </w:hyperlink>
+      <w:r>
+        <w:rPr>
+          <w:sz w:val="32"/>
+          <w:szCs w:val="32"/>
+        </w:rPr>
+        <w:t xml:space="preserve"> </w:t>
+      </w:r>
+    </w:p>
+    <w:p>
+      <w:pPr>
+        <w:pStyle w:val="ListParagraph"/>
+        <w:numPr>
+          <w:ilvl w:val="0"/>
+          <w:numId w:val="1"/>
+        </w:numPr>
+        <w:rPr>
+          <w:sz w:val="32"/>
+          <w:szCs w:val="32"/>
+        </w:rPr>
+      </w:pPr>
+      <w:r>
+        <w:rPr>
+          <w:sz w:val="32"/>
+          <w:szCs w:val="32"/>
+        </w:rPr>
+        <w:t xml:space="preserve">US Open: </w:t>
+      </w:r>
+      <w:hyperlink r:id="rId33" w:history="1">
+        <w:r>
+          <w:rPr>
+            <w:rStyle w:val="Hyperlink"/>
+            <w:sz w:val="32"/>
+            <w:szCs w:val="32"/>
+          </w:rPr>
+          <w:t>https://us-open-draft.vercel.app/</w:t>
         </w:r>
       </w:hyperlink>
       <w:r>

</xml_diff>

<commit_message>
Update Job Finder link to live Vercel URL
Old GitHub Pages URL (aidanlconnolly.github.io/jobfinder) was dead; point
landing page + source doc at https://job-finder-app-liard-eta.vercel.app/

Co-Authored-By: Claude Opus 4.8 <noreply@anthropic.com>
</commit_message>
<xml_diff>
--- a/Website links to share.docx
+++ b/Website links to share.docx
@@ -48,7 +48,7 @@
             <w:sz w:val="32"/>
             <w:szCs w:val="32"/>
           </w:rPr>
-          <w:t>https://aidanlconnolly.github.io/jobfinder/</w:t>
+          <w:t>https://job-finder-app-liard-eta.vercel.app/</w:t>
         </w:r>
       </w:hyperlink>
     </w:p>
@@ -1093,6 +1093,43 @@
             <w:szCs w:val="32"/>
           </w:rPr>
           <w:t>https://us-open-draft.vercel.app/</w:t>
+        </w:r>
+      </w:hyperlink>
+      <w:r>
+        <w:rPr>
+          <w:sz w:val="32"/>
+          <w:szCs w:val="32"/>
+        </w:rPr>
+        <w:t xml:space="preserve"> </w:t>
+      </w:r>
+    </w:p>
+    <w:p>
+      <w:pPr>
+        <w:pStyle w:val="ListParagraph"/>
+        <w:numPr>
+          <w:ilvl w:val="0"/>
+          <w:numId w:val="1"/>
+        </w:numPr>
+        <w:rPr>
+          <w:sz w:val="32"/>
+          <w:szCs w:val="32"/>
+        </w:rPr>
+      </w:pPr>
+      <w:r>
+        <w:rPr>
+          <w:sz w:val="32"/>
+          <w:szCs w:val="32"/>
+        </w:rPr>
+        <w:t xml:space="preserve">Tiny Tower game: </w:t>
+      </w:r>
+      <w:hyperlink r:id="rId34" w:history="1">
+        <w:r>
+          <w:rPr>
+            <w:rStyle w:val="Hyperlink"/>
+            <w:sz w:val="32"/>
+            <w:szCs w:val="32"/>
+          </w:rPr>
+          <w:t>https://pocket-tower.vercel.app/</w:t>
         </w:r>
       </w:hyperlink>
       <w:r>

</xml_diff>